<commit_message>
fix usecase and modify diagram
</commit_message>
<xml_diff>
--- a/docs/diagrams/Use-case detail-scenario/SS5/UC_SS5_DuongDangKhoa.docx
+++ b/docs/diagrams/Use-case detail-scenario/SS5/UC_SS5_DuongDangKhoa.docx
@@ -14,11 +14,7 @@
       </w:pPr>
       <w:r>
         <w:rPr/>
-        <w:t>ĐẶC TẢ CHI TIẾT USE-CASE SCENARIO — PHÂN HỆ SS</w:t>
-      </w:r>
-      <w:r>
-        <w:rPr/>
-        <w:t>5</w:t>
+        <w:t>ĐẶC TẢ CHI TIẾT USE-CASE SCENARIO — PHÂN HỆ SS5</w:t>
       </w:r>
     </w:p>
     <w:p>
@@ -45,31 +41,16 @@
     </w:p>
     <w:p>
       <w:pPr>
-        <w:pStyle w:val="BlockQuotationuser"/>
+        <w:pStyle w:val="BlockQuotation"/>
         <w:rPr/>
       </w:pPr>
       <w:r>
         <w:rPr/>
         <w:t>Dự án: Smart E-Mobility Hub — ĐHQG-HCM</w:t>
         <w:br/>
-        <w:t>Phân hệ: SS</w:t>
-      </w:r>
-      <w:r>
-        <w:rPr/>
-        <w:t>5</w:t>
-      </w:r>
-      <w:r>
-        <w:rPr/>
+        <w:t>Phân hệ: SS5</w:t>
         <w:br/>
-        <w:t>Tác giả: Dương Đăng Khoa (TV</w:t>
-      </w:r>
-      <w:r>
-        <w:rPr/>
-        <w:t>5</w:t>
-      </w:r>
-      <w:r>
-        <w:rPr/>
-        <w:t xml:space="preserve"> — Developer / Analyst)</w:t>
+        <w:t>Tác giả: Dương Đăng Khoa (TV5 — Developer / Analyst)</w:t>
         <w:br/>
         <w:t>Nhóm: Nhóm 7 Thành viên — BTL Công nghệ Phần mềm (CO3001) — HCMUT</w:t>
       </w:r>
@@ -122,8 +103,8 @@
       </w:tblPr>
       <w:tblGrid>
         <w:gridCol w:w="1749"/>
-        <w:gridCol w:w="3853"/>
-        <w:gridCol w:w="2170"/>
+        <w:gridCol w:w="3852"/>
+        <w:gridCol w:w="2171"/>
         <w:gridCol w:w="1866"/>
       </w:tblGrid>
       <w:tr>
@@ -221,11 +202,7 @@
             </w:pPr>
             <w:r>
               <w:rPr/>
-              <w:t>UC_SS</w:t>
-            </w:r>
-            <w:r>
-              <w:rPr/>
-              <w:t>5_01</w:t>
+              <w:t>UC_SS5_01</w:t>
             </w:r>
           </w:p>
         </w:tc>
@@ -309,37 +286,29 @@
         </w:tc>
         <w:tc>
           <w:tcPr>
-            <w:tcW w:w="3853" w:type="dxa"/>
-            <w:tcBorders>
-              <w:top w:val="single" w:sz="4" w:space="0" w:color="000000"/>
-              <w:start w:val="single" w:sz="4" w:space="0" w:color="000000"/>
-              <w:bottom w:val="single" w:sz="4" w:space="0" w:color="000000"/>
-              <w:end w:val="single" w:sz="4" w:space="0" w:color="000000"/>
-            </w:tcBorders>
-            <w:vAlign w:val="center"/>
-          </w:tcPr>
-          <w:p>
-            <w:pPr>
-              <w:pStyle w:val="Normal"/>
-              <w:rPr/>
-            </w:pPr>
-            <w:r>
-              <w:rPr/>
-              <w:t>Dương Đăng Khoa (TV</w:t>
-            </w:r>
-            <w:r>
-              <w:rPr/>
-              <w:t>5</w:t>
-            </w:r>
-            <w:r>
-              <w:rPr/>
-              <w:t>/Developer, Analyst)</w:t>
-            </w:r>
-          </w:p>
-        </w:tc>
-        <w:tc>
-          <w:tcPr>
-            <w:tcW w:w="2170" w:type="dxa"/>
+            <w:tcW w:w="3852" w:type="dxa"/>
+            <w:tcBorders>
+              <w:top w:val="single" w:sz="4" w:space="0" w:color="000000"/>
+              <w:start w:val="single" w:sz="4" w:space="0" w:color="000000"/>
+              <w:bottom w:val="single" w:sz="4" w:space="0" w:color="000000"/>
+              <w:end w:val="single" w:sz="4" w:space="0" w:color="000000"/>
+            </w:tcBorders>
+            <w:vAlign w:val="center"/>
+          </w:tcPr>
+          <w:p>
+            <w:pPr>
+              <w:pStyle w:val="Normal"/>
+              <w:rPr/>
+            </w:pPr>
+            <w:r>
+              <w:rPr/>
+              <w:t>Dương Đăng Khoa (TV5/Developer, Analyst)</w:t>
+            </w:r>
+          </w:p>
+        </w:tc>
+        <w:tc>
+          <w:tcPr>
+            <w:tcW w:w="2171" w:type="dxa"/>
             <w:tcBorders>
               <w:top w:val="single" w:sz="4" w:space="0" w:color="000000"/>
               <w:start w:val="single" w:sz="4" w:space="0" w:color="000000"/>
@@ -412,37 +381,29 @@
         </w:tc>
         <w:tc>
           <w:tcPr>
-            <w:tcW w:w="3853" w:type="dxa"/>
-            <w:tcBorders>
-              <w:top w:val="single" w:sz="4" w:space="0" w:color="000000"/>
-              <w:start w:val="single" w:sz="4" w:space="0" w:color="000000"/>
-              <w:bottom w:val="single" w:sz="4" w:space="0" w:color="000000"/>
-              <w:end w:val="single" w:sz="4" w:space="0" w:color="000000"/>
-            </w:tcBorders>
-            <w:vAlign w:val="center"/>
-          </w:tcPr>
-          <w:p>
-            <w:pPr>
-              <w:pStyle w:val="Normal"/>
-              <w:rPr/>
-            </w:pPr>
-            <w:r>
-              <w:rPr/>
-              <w:t>1</w:t>
-            </w:r>
-            <w:r>
-              <w:rPr/>
-              <w:t>9</w:t>
-            </w:r>
-            <w:r>
-              <w:rPr/>
-              <w:t>/09/2026</w:t>
-            </w:r>
-          </w:p>
-        </w:tc>
-        <w:tc>
-          <w:tcPr>
-            <w:tcW w:w="2170" w:type="dxa"/>
+            <w:tcW w:w="3852" w:type="dxa"/>
+            <w:tcBorders>
+              <w:top w:val="single" w:sz="4" w:space="0" w:color="000000"/>
+              <w:start w:val="single" w:sz="4" w:space="0" w:color="000000"/>
+              <w:bottom w:val="single" w:sz="4" w:space="0" w:color="000000"/>
+              <w:end w:val="single" w:sz="4" w:space="0" w:color="000000"/>
+            </w:tcBorders>
+            <w:vAlign w:val="center"/>
+          </w:tcPr>
+          <w:p>
+            <w:pPr>
+              <w:pStyle w:val="Normal"/>
+              <w:rPr/>
+            </w:pPr>
+            <w:r>
+              <w:rPr/>
+              <w:t>19/09/2026</w:t>
+            </w:r>
+          </w:p>
+        </w:tc>
+        <w:tc>
+          <w:tcPr>
+            <w:tcW w:w="2171" w:type="dxa"/>
             <w:tcBorders>
               <w:top w:val="single" w:sz="4" w:space="0" w:color="000000"/>
               <w:start w:val="single" w:sz="4" w:space="0" w:color="000000"/>
@@ -482,17 +443,15 @@
             </w:pPr>
             <w:r>
               <w:rPr/>
-              <w:t>20</w:t>
-            </w:r>
-            <w:r>
-              <w:rPr/>
-              <w:t>/09/2026</w:t>
+              <w:t>22/09/2026</w:t>
             </w:r>
           </w:p>
         </w:tc>
       </w:tr>
       <w:tr>
-        <w:trPr/>
+        <w:trPr>
+          <w:trHeight w:val="492" w:hRule="atLeast"/>
+        </w:trPr>
         <w:tc>
           <w:tcPr>
             <w:tcW w:w="1749" w:type="dxa"/>
@@ -548,7 +507,7 @@
             </w:pPr>
             <w:r>
               <w:rPr/>
-              <w:t>Secondary: Hệ thống quản lý Hub, Trạm sạc, Cảm biến IoT, Bộ nhớ tạm in-memory (st.session_state).</w:t>
+              <w:t>Secondary: Hệ thống quản lý Hub.</w:t>
             </w:r>
           </w:p>
         </w:tc>
@@ -601,7 +560,18 @@
             </w:pPr>
             <w:r>
               <w:rPr/>
-              <w:t>Hệ thống tự động lập lịch và xếp hàng sạc cho các phương tiện tại các Hub dựa trên mức độ ưu tiên, bao gồm mức pin (SoC), thời gian chờ, thời gian dự kiến sử dụng xe và mức độ khẩn cấp. Hệ thống đồng thời xem xét công suất sạc khả dụng và khung giờ điện để phân bổ tài nguyên sạc hợp lý, hạn chế quá tải, đồng thời xử lý trạng thái xe sau khi sạc đầy và tình trạng chiếm dụng cổng sạc.</w:t>
+              <w:t>Hệ thống tự động lập lịch và sắp xếp hàng chờ sạc cho các phương tiện tại Hub dựa trên mức độ ưu tiên, bao gồm mức pin (SoC), thời gian chờ, thời gian dự kiến sử dụng xe và mức độ khẩn cấp.</w:t>
+            </w:r>
+          </w:p>
+          <w:p>
+            <w:pPr>
+              <w:pStyle w:val="Normal"/>
+              <w:bidi w:val="0"/>
+              <w:rPr/>
+            </w:pPr>
+            <w:r>
+              <w:rPr/>
+              <w:t>Hệ thống đồng thời xem xét cổng sạc khả dụng, công suất sạc và biểu giá điện theo khung giờ peak/off-peak để lựa chọn thời điểm và phân bổ tài nguyên sạc phù hợp, đồng thời hạn chế vượt giới hạn công suất.</w:t>
             </w:r>
           </w:p>
         </w:tc>
@@ -834,40 +804,12 @@
               <w:t>5. Nếu công suất hiện tại không đủ, hệ thống điều chỉnh lịch sạc để tránh vượt giới hạn công suất.</w:t>
             </w:r>
           </w:p>
-          <w:p>
-            <w:pPr>
-              <w:pStyle w:val="Normal"/>
-              <w:bidi w:val="0"/>
-              <w:rPr/>
-            </w:pPr>
-            <w:r>
-              <w:rPr/>
-              <w:t xml:space="preserve">6. </w:t>
-            </w:r>
-            <w:r>
-              <w:rPr/>
-              <w:t>Khi phương tiện sạc đầy, hệ thống gửi thông báo cho sinh viên và tạo biên nhận chi phí điện năng đã nạp.</w:t>
-            </w:r>
-          </w:p>
-          <w:p>
-            <w:pPr>
-              <w:pStyle w:val="Normal"/>
-              <w:bidi w:val="0"/>
-              <w:rPr/>
-            </w:pPr>
-            <w:r>
-              <w:rPr/>
-              <w:t xml:space="preserve">7. </w:t>
-            </w:r>
-            <w:r>
-              <w:rPr/>
-              <w:t>Nếu phương tiện vẫn chiếm dụng cổng sạc sau 15 phút ân hạn kể từ khi sạc đầy, hệ thống áp dụng Overstay fee.</w:t>
-            </w:r>
-          </w:p>
         </w:tc>
       </w:tr>
       <w:tr>
-        <w:trPr/>
+        <w:trPr>
+          <w:trHeight w:val="5163" w:hRule="atLeast"/>
+        </w:trPr>
         <w:tc>
           <w:tcPr>
             <w:tcW w:w="1749" w:type="dxa"/>
@@ -1000,40 +942,7 @@
             </w:pPr>
             <w:r>
               <w:rPr/>
-              <w:t>9. Khi một phương tiện hoàn tất sạc, hệ thống tự động cập nhật trạng thái và đưa phương tiện tiếp theo trong hàng đợi vào vị trí sạc nếu đáp ứng điều kiện.</w:t>
-            </w:r>
-          </w:p>
-          <w:p>
-            <w:pPr>
-              <w:pStyle w:val="Normal"/>
-              <w:bidi w:val="0"/>
-              <w:rPr/>
-            </w:pPr>
-            <w:r>
-              <w:rPr/>
-              <w:t>10. Khi phương tiện hoàn tất sạc, hệ thống cập nhật trạng thái phương tiện thành đã sạc đầy và gửi thông báo cho sinh viên.</w:t>
-            </w:r>
-          </w:p>
-          <w:p>
-            <w:pPr>
-              <w:pStyle w:val="Normal"/>
-              <w:bidi w:val="0"/>
-              <w:rPr/>
-            </w:pPr>
-            <w:r>
-              <w:rPr/>
-              <w:t>11. Hệ thống tính toán chi phí điện năng đã sử dụng và tạo biên nhận cho sinh viên.</w:t>
-            </w:r>
-          </w:p>
-          <w:p>
-            <w:pPr>
-              <w:pStyle w:val="Normal"/>
-              <w:bidi w:val="0"/>
-              <w:rPr/>
-            </w:pPr>
-            <w:r>
-              <w:rPr/>
-              <w:t>12. Hệ thống bắt đầu theo dõi thời gian phương tiện tiếp tục chiếm dụng cổng sạc sau khi đã sạc đầy.</w:t>
+              <w:t>9. Khi một phương tiện hoàn tất sạc, hệ thống cập nhật trạng thái và giải phóng tài nguyên sạc để phương tiện tiếp theo trong hàng đợi có thể được phân bổ nếu đáp ứng điều kiện.</w:t>
             </w:r>
           </w:p>
         </w:tc>
@@ -1215,17 +1124,6 @@
               <w:t>Exception 4 (Mất dữ liệu trạng thái): Nếu hệ thống không nhận được dữ liệu SoC hoặc trạng thái cổng sạc, hệ thống tạm thời không thực hiện phân bổ tự động đối với phương tiện bị thiếu dữ liệu và thông báo cho chuyên viên vận hành.</w:t>
             </w:r>
           </w:p>
-          <w:p>
-            <w:pPr>
-              <w:pStyle w:val="Normal"/>
-              <w:bidi w:val="0"/>
-              <w:rPr/>
-            </w:pPr>
-            <w:r>
-              <w:rPr/>
-              <w:t>Exception 5 (Xe sạc đầy nhưng chưa được di dời): Sau khi phương tiện đạt trạng thái đầy pin, hệ thống gửi cảnh báo cho sinh viên/chủ xe và bắt đầu thời gian ân hạn 15 phút. Nếu sau 15 phút phương tiện vẫn chưa được di dời hoặc rút sạc, hệ thống áp dụng Overstay fee và cập nhật chi phí vào biên nhận.</w:t>
-            </w:r>
-          </w:p>
         </w:tc>
       </w:tr>
       <w:tr>
@@ -1275,6 +1173,1352 @@
             <w:r>
               <w:rPr/>
               <w:t>Hệ thống ưu tiên phương tiện dựa trên các tiêu chí: mức pin (SoC), thời gian chờ, thời gian dự kiến sử dụng và mức độ khẩn cấp. Việc lập lịch cần xem xét công suất sạc khả dụng và nhu cầu sử dụng, phù hợp với yêu cầu Smart Charging của hệ thống. Dữ liệu trạng thái có thể được lấy từ IoT hoặc dữ liệu mô phỏng.</w:t>
+            </w:r>
+          </w:p>
+        </w:tc>
+      </w:tr>
+    </w:tbl>
+    <w:p>
+      <w:pPr>
+        <w:pStyle w:val="HorizontalLine"/>
+        <w:rPr/>
+      </w:pPr>
+      <w:r>
+        <w:rPr/>
+      </w:r>
+    </w:p>
+    <w:p>
+      <w:pPr>
+        <w:pStyle w:val="BodyText"/>
+        <w:rPr/>
+      </w:pPr>
+      <w:r>
+        <w:rPr/>
+      </w:r>
+    </w:p>
+    <w:p>
+      <w:pPr>
+        <w:pStyle w:val="Heading2"/>
+        <w:numPr>
+          <w:ilvl w:val="0"/>
+          <w:numId w:val="0"/>
+        </w:numPr>
+        <w:ind w:hanging="0" w:start="0"/>
+        <w:rPr/>
+      </w:pPr>
+      <w:r>
+        <w:rPr/>
+        <w:t xml:space="preserve">USE-CASE </w:t>
+      </w:r>
+      <w:r>
+        <w:rPr/>
+        <w:t>2</w:t>
+      </w:r>
+      <w:r>
+        <w:rPr/>
+        <w:t xml:space="preserve">:  giám sát hàng chờ sạc </w:t>
+      </w:r>
+    </w:p>
+    <w:tbl>
+      <w:tblPr>
+        <w:tblW w:w="9638" w:type="dxa"/>
+        <w:jc w:val="start"/>
+        <w:tblInd w:w="0" w:type="dxa"/>
+        <w:tblLayout w:type="fixed"/>
+        <w:tblCellMar>
+          <w:top w:w="28" w:type="dxa"/>
+          <w:start w:w="28" w:type="dxa"/>
+          <w:bottom w:w="28" w:type="dxa"/>
+          <w:end w:w="28" w:type="dxa"/>
+        </w:tblCellMar>
+        <w:tblLook w:noHBand="0" w:noVBand="0" w:firstColumn="0" w:lastRow="0" w:lastColumn="0" w:firstRow="0" w:val="0000"/>
+      </w:tblPr>
+      <w:tblGrid>
+        <w:gridCol w:w="1749"/>
+        <w:gridCol w:w="3852"/>
+        <w:gridCol w:w="2171"/>
+        <w:gridCol w:w="1866"/>
+      </w:tblGrid>
+      <w:tr>
+        <w:trPr>
+          <w:tblHeader w:val="true"/>
+        </w:trPr>
+        <w:tc>
+          <w:tcPr>
+            <w:tcW w:w="1749" w:type="dxa"/>
+            <w:tcBorders>
+              <w:top w:val="single" w:sz="4" w:space="0" w:color="000000"/>
+              <w:start w:val="single" w:sz="4" w:space="0" w:color="000000"/>
+              <w:bottom w:val="single" w:sz="4" w:space="0" w:color="000000"/>
+              <w:end w:val="single" w:sz="4" w:space="0" w:color="000000"/>
+            </w:tcBorders>
+            <w:vAlign w:val="center"/>
+          </w:tcPr>
+          <w:p>
+            <w:pPr>
+              <w:pStyle w:val="TableHeading"/>
+              <w:rPr/>
+            </w:pPr>
+            <w:r>
+              <w:rPr/>
+              <w:t>Field Name</w:t>
+            </w:r>
+          </w:p>
+        </w:tc>
+        <w:tc>
+          <w:tcPr>
+            <w:tcW w:w="7889" w:type="dxa"/>
+            <w:gridSpan w:val="3"/>
+            <w:tcBorders>
+              <w:top w:val="single" w:sz="4" w:space="0" w:color="000000"/>
+              <w:start w:val="single" w:sz="4" w:space="0" w:color="000000"/>
+              <w:bottom w:val="single" w:sz="4" w:space="0" w:color="000000"/>
+              <w:end w:val="single" w:sz="4" w:space="0" w:color="000000"/>
+            </w:tcBorders>
+            <w:vAlign w:val="center"/>
+          </w:tcPr>
+          <w:p>
+            <w:pPr>
+              <w:pStyle w:val="TableHeading"/>
+              <w:rPr/>
+            </w:pPr>
+            <w:r>
+              <w:rPr/>
+              <w:t>Detail Content</w:t>
+            </w:r>
+          </w:p>
+        </w:tc>
+      </w:tr>
+      <w:tr>
+        <w:trPr/>
+        <w:tc>
+          <w:tcPr>
+            <w:tcW w:w="1749" w:type="dxa"/>
+            <w:tcBorders>
+              <w:top w:val="single" w:sz="4" w:space="0" w:color="000000"/>
+              <w:start w:val="single" w:sz="4" w:space="0" w:color="000000"/>
+              <w:bottom w:val="single" w:sz="4" w:space="0" w:color="000000"/>
+              <w:end w:val="single" w:sz="4" w:space="0" w:color="000000"/>
+            </w:tcBorders>
+            <w:vAlign w:val="center"/>
+          </w:tcPr>
+          <w:p>
+            <w:pPr>
+              <w:pStyle w:val="TableContents"/>
+              <w:rPr/>
+            </w:pPr>
+            <w:r>
+              <w:rPr>
+                <w:rStyle w:val="Strong"/>
+              </w:rPr>
+              <w:t>Use Case ID:</w:t>
+            </w:r>
+          </w:p>
+        </w:tc>
+        <w:tc>
+          <w:tcPr>
+            <w:tcW w:w="7889" w:type="dxa"/>
+            <w:gridSpan w:val="3"/>
+            <w:tcBorders>
+              <w:top w:val="single" w:sz="4" w:space="0" w:color="000000"/>
+              <w:start w:val="single" w:sz="4" w:space="0" w:color="000000"/>
+              <w:bottom w:val="single" w:sz="4" w:space="0" w:color="000000"/>
+              <w:end w:val="single" w:sz="4" w:space="0" w:color="000000"/>
+            </w:tcBorders>
+            <w:vAlign w:val="center"/>
+          </w:tcPr>
+          <w:p>
+            <w:pPr>
+              <w:pStyle w:val="Normal"/>
+              <w:rPr/>
+            </w:pPr>
+            <w:r>
+              <w:rPr/>
+              <w:t>UC_SS5_02</w:t>
+            </w:r>
+          </w:p>
+        </w:tc>
+      </w:tr>
+      <w:tr>
+        <w:trPr/>
+        <w:tc>
+          <w:tcPr>
+            <w:tcW w:w="1749" w:type="dxa"/>
+            <w:tcBorders>
+              <w:top w:val="single" w:sz="4" w:space="0" w:color="000000"/>
+              <w:start w:val="single" w:sz="4" w:space="0" w:color="000000"/>
+              <w:bottom w:val="single" w:sz="4" w:space="0" w:color="000000"/>
+              <w:end w:val="single" w:sz="4" w:space="0" w:color="000000"/>
+            </w:tcBorders>
+            <w:vAlign w:val="center"/>
+          </w:tcPr>
+          <w:p>
+            <w:pPr>
+              <w:pStyle w:val="TableContents"/>
+              <w:rPr/>
+            </w:pPr>
+            <w:r>
+              <w:rPr>
+                <w:rStyle w:val="Strong"/>
+              </w:rPr>
+              <w:t>Use Case Name:</w:t>
+            </w:r>
+          </w:p>
+        </w:tc>
+        <w:tc>
+          <w:tcPr>
+            <w:tcW w:w="7889" w:type="dxa"/>
+            <w:gridSpan w:val="3"/>
+            <w:tcBorders>
+              <w:top w:val="single" w:sz="4" w:space="0" w:color="000000"/>
+              <w:start w:val="single" w:sz="4" w:space="0" w:color="000000"/>
+              <w:bottom w:val="single" w:sz="4" w:space="0" w:color="000000"/>
+              <w:end w:val="single" w:sz="4" w:space="0" w:color="000000"/>
+            </w:tcBorders>
+            <w:vAlign w:val="center"/>
+          </w:tcPr>
+          <w:p>
+            <w:pPr>
+              <w:pStyle w:val="Normal"/>
+              <w:bidi w:val="0"/>
+              <w:rPr/>
+            </w:pPr>
+            <w:r>
+              <w:rPr/>
+              <w:t>UC_Giam_Sat_Hang_Cho_Sac</w:t>
+            </w:r>
+          </w:p>
+        </w:tc>
+      </w:tr>
+      <w:tr>
+        <w:trPr/>
+        <w:tc>
+          <w:tcPr>
+            <w:tcW w:w="1749" w:type="dxa"/>
+            <w:tcBorders>
+              <w:top w:val="single" w:sz="4" w:space="0" w:color="000000"/>
+              <w:start w:val="single" w:sz="4" w:space="0" w:color="000000"/>
+              <w:bottom w:val="single" w:sz="4" w:space="0" w:color="000000"/>
+              <w:end w:val="single" w:sz="4" w:space="0" w:color="000000"/>
+            </w:tcBorders>
+            <w:vAlign w:val="center"/>
+          </w:tcPr>
+          <w:p>
+            <w:pPr>
+              <w:pStyle w:val="TableContents"/>
+              <w:rPr/>
+            </w:pPr>
+            <w:r>
+              <w:rPr>
+                <w:rStyle w:val="Strong"/>
+              </w:rPr>
+              <w:t>Created By:</w:t>
+            </w:r>
+          </w:p>
+        </w:tc>
+        <w:tc>
+          <w:tcPr>
+            <w:tcW w:w="3852" w:type="dxa"/>
+            <w:tcBorders>
+              <w:top w:val="single" w:sz="4" w:space="0" w:color="000000"/>
+              <w:start w:val="single" w:sz="4" w:space="0" w:color="000000"/>
+              <w:bottom w:val="single" w:sz="4" w:space="0" w:color="000000"/>
+              <w:end w:val="single" w:sz="4" w:space="0" w:color="000000"/>
+            </w:tcBorders>
+            <w:vAlign w:val="center"/>
+          </w:tcPr>
+          <w:p>
+            <w:pPr>
+              <w:pStyle w:val="Normal"/>
+              <w:rPr/>
+            </w:pPr>
+            <w:r>
+              <w:rPr/>
+              <w:t>Dương Đăng Khoa (TV5/Developer, Analyst)</w:t>
+            </w:r>
+          </w:p>
+        </w:tc>
+        <w:tc>
+          <w:tcPr>
+            <w:tcW w:w="2171" w:type="dxa"/>
+            <w:tcBorders>
+              <w:top w:val="single" w:sz="4" w:space="0" w:color="000000"/>
+              <w:start w:val="single" w:sz="4" w:space="0" w:color="000000"/>
+              <w:bottom w:val="single" w:sz="4" w:space="0" w:color="000000"/>
+              <w:end w:val="single" w:sz="4" w:space="0" w:color="000000"/>
+            </w:tcBorders>
+            <w:vAlign w:val="center"/>
+          </w:tcPr>
+          <w:p>
+            <w:pPr>
+              <w:pStyle w:val="TableContents"/>
+              <w:rPr/>
+            </w:pPr>
+            <w:r>
+              <w:rPr>
+                <w:rStyle w:val="Strong"/>
+              </w:rPr>
+              <w:t>Last Updated By:</w:t>
+            </w:r>
+          </w:p>
+        </w:tc>
+        <w:tc>
+          <w:tcPr>
+            <w:tcW w:w="1866" w:type="dxa"/>
+            <w:tcBorders>
+              <w:top w:val="single" w:sz="4" w:space="0" w:color="000000"/>
+              <w:start w:val="single" w:sz="4" w:space="0" w:color="000000"/>
+              <w:bottom w:val="single" w:sz="4" w:space="0" w:color="000000"/>
+              <w:end w:val="single" w:sz="4" w:space="0" w:color="000000"/>
+            </w:tcBorders>
+            <w:vAlign w:val="center"/>
+          </w:tcPr>
+          <w:p>
+            <w:pPr>
+              <w:pStyle w:val="Normal"/>
+              <w:rPr/>
+            </w:pPr>
+            <w:r>
+              <w:rPr/>
+              <w:t>Dương Đăng Khoa</w:t>
+            </w:r>
+          </w:p>
+        </w:tc>
+      </w:tr>
+      <w:tr>
+        <w:trPr/>
+        <w:tc>
+          <w:tcPr>
+            <w:tcW w:w="1749" w:type="dxa"/>
+            <w:tcBorders>
+              <w:top w:val="single" w:sz="4" w:space="0" w:color="000000"/>
+              <w:start w:val="single" w:sz="4" w:space="0" w:color="000000"/>
+              <w:bottom w:val="single" w:sz="4" w:space="0" w:color="000000"/>
+              <w:end w:val="single" w:sz="4" w:space="0" w:color="000000"/>
+            </w:tcBorders>
+            <w:vAlign w:val="center"/>
+          </w:tcPr>
+          <w:p>
+            <w:pPr>
+              <w:pStyle w:val="TableContents"/>
+              <w:rPr/>
+            </w:pPr>
+            <w:r>
+              <w:rPr>
+                <w:rStyle w:val="Strong"/>
+              </w:rPr>
+              <w:t>Date Created:</w:t>
+            </w:r>
+          </w:p>
+        </w:tc>
+        <w:tc>
+          <w:tcPr>
+            <w:tcW w:w="3852" w:type="dxa"/>
+            <w:tcBorders>
+              <w:top w:val="single" w:sz="4" w:space="0" w:color="000000"/>
+              <w:start w:val="single" w:sz="4" w:space="0" w:color="000000"/>
+              <w:bottom w:val="single" w:sz="4" w:space="0" w:color="000000"/>
+              <w:end w:val="single" w:sz="4" w:space="0" w:color="000000"/>
+            </w:tcBorders>
+            <w:vAlign w:val="center"/>
+          </w:tcPr>
+          <w:p>
+            <w:pPr>
+              <w:pStyle w:val="Normal"/>
+              <w:rPr/>
+            </w:pPr>
+            <w:r>
+              <w:rPr/>
+              <w:t>19/09/2026</w:t>
+            </w:r>
+          </w:p>
+        </w:tc>
+        <w:tc>
+          <w:tcPr>
+            <w:tcW w:w="2171" w:type="dxa"/>
+            <w:tcBorders>
+              <w:top w:val="single" w:sz="4" w:space="0" w:color="000000"/>
+              <w:start w:val="single" w:sz="4" w:space="0" w:color="000000"/>
+              <w:bottom w:val="single" w:sz="4" w:space="0" w:color="000000"/>
+              <w:end w:val="single" w:sz="4" w:space="0" w:color="000000"/>
+            </w:tcBorders>
+            <w:vAlign w:val="center"/>
+          </w:tcPr>
+          <w:p>
+            <w:pPr>
+              <w:pStyle w:val="TableContents"/>
+              <w:rPr/>
+            </w:pPr>
+            <w:r>
+              <w:rPr>
+                <w:rStyle w:val="Strong"/>
+              </w:rPr>
+              <w:t>Date Last Updated:</w:t>
+            </w:r>
+          </w:p>
+        </w:tc>
+        <w:tc>
+          <w:tcPr>
+            <w:tcW w:w="1866" w:type="dxa"/>
+            <w:tcBorders>
+              <w:top w:val="single" w:sz="4" w:space="0" w:color="000000"/>
+              <w:start w:val="single" w:sz="4" w:space="0" w:color="000000"/>
+              <w:bottom w:val="single" w:sz="4" w:space="0" w:color="000000"/>
+              <w:end w:val="single" w:sz="4" w:space="0" w:color="000000"/>
+            </w:tcBorders>
+            <w:vAlign w:val="center"/>
+          </w:tcPr>
+          <w:p>
+            <w:pPr>
+              <w:pStyle w:val="Normal"/>
+              <w:rPr/>
+            </w:pPr>
+            <w:r>
+              <w:rPr/>
+              <w:t>22/09/2026</w:t>
+            </w:r>
+          </w:p>
+        </w:tc>
+      </w:tr>
+      <w:tr>
+        <w:trPr/>
+        <w:tc>
+          <w:tcPr>
+            <w:tcW w:w="1749" w:type="dxa"/>
+            <w:tcBorders>
+              <w:top w:val="single" w:sz="4" w:space="0" w:color="000000"/>
+              <w:start w:val="single" w:sz="4" w:space="0" w:color="000000"/>
+              <w:bottom w:val="single" w:sz="4" w:space="0" w:color="000000"/>
+              <w:end w:val="single" w:sz="4" w:space="0" w:color="000000"/>
+            </w:tcBorders>
+            <w:vAlign w:val="center"/>
+          </w:tcPr>
+          <w:p>
+            <w:pPr>
+              <w:pStyle w:val="TableContents"/>
+              <w:rPr/>
+            </w:pPr>
+            <w:r>
+              <w:rPr>
+                <w:rStyle w:val="Strong"/>
+              </w:rPr>
+              <w:t>Actors:</w:t>
+            </w:r>
+          </w:p>
+        </w:tc>
+        <w:tc>
+          <w:tcPr>
+            <w:tcW w:w="7889" w:type="dxa"/>
+            <w:gridSpan w:val="3"/>
+            <w:tcBorders>
+              <w:top w:val="single" w:sz="4" w:space="0" w:color="000000"/>
+              <w:start w:val="single" w:sz="4" w:space="0" w:color="000000"/>
+              <w:bottom w:val="single" w:sz="4" w:space="0" w:color="000000"/>
+              <w:end w:val="single" w:sz="4" w:space="0" w:color="000000"/>
+            </w:tcBorders>
+            <w:vAlign w:val="center"/>
+          </w:tcPr>
+          <w:p>
+            <w:pPr>
+              <w:pStyle w:val="Normal"/>
+              <w:bidi w:val="0"/>
+              <w:rPr/>
+            </w:pPr>
+            <w:r>
+              <w:rPr/>
+              <w:t>Primary: Chuyên viên sạc / Nhân viên vận hành (Charging Operator).</w:t>
+            </w:r>
+          </w:p>
+          <w:p>
+            <w:pPr>
+              <w:pStyle w:val="Normal"/>
+              <w:bidi w:val="0"/>
+              <w:rPr/>
+            </w:pPr>
+            <w:r>
+              <w:rPr/>
+              <w:t>Secondary: Secondary: Hệ thống quản lý Hub, Trạm sạc, Cảm biến IoT.</w:t>
+            </w:r>
+          </w:p>
+        </w:tc>
+      </w:tr>
+      <w:tr>
+        <w:trPr>
+          <w:trHeight w:val="372" w:hRule="atLeast"/>
+        </w:trPr>
+        <w:tc>
+          <w:tcPr>
+            <w:tcW w:w="1749" w:type="dxa"/>
+            <w:tcBorders>
+              <w:top w:val="single" w:sz="4" w:space="0" w:color="000000"/>
+              <w:start w:val="single" w:sz="4" w:space="0" w:color="000000"/>
+              <w:bottom w:val="single" w:sz="4" w:space="0" w:color="000000"/>
+              <w:end w:val="single" w:sz="4" w:space="0" w:color="000000"/>
+            </w:tcBorders>
+            <w:vAlign w:val="center"/>
+          </w:tcPr>
+          <w:p>
+            <w:pPr>
+              <w:pStyle w:val="TableContents"/>
+              <w:rPr/>
+            </w:pPr>
+            <w:r>
+              <w:rPr>
+                <w:rStyle w:val="Strong"/>
+              </w:rPr>
+              <w:t>Description:</w:t>
+            </w:r>
+          </w:p>
+        </w:tc>
+        <w:tc>
+          <w:tcPr>
+            <w:tcW w:w="7889" w:type="dxa"/>
+            <w:gridSpan w:val="3"/>
+            <w:tcBorders>
+              <w:top w:val="single" w:sz="4" w:space="0" w:color="000000"/>
+              <w:start w:val="single" w:sz="4" w:space="0" w:color="000000"/>
+              <w:bottom w:val="single" w:sz="4" w:space="0" w:color="000000"/>
+              <w:end w:val="single" w:sz="4" w:space="0" w:color="000000"/>
+            </w:tcBorders>
+            <w:vAlign w:val="center"/>
+          </w:tcPr>
+          <w:p>
+            <w:pPr>
+              <w:pStyle w:val="Normal"/>
+              <w:bidi w:val="0"/>
+              <w:rPr/>
+            </w:pPr>
+            <w:r>
+              <w:rPr/>
+              <w:t>Hệ thống cho phép chuyên viên sạc theo dõi trạng thái các phương tiện trong hàng chờ, trạng thái các cổng sạc và quá trình sạc. Hệ thống tự động cập nhật thứ tự hàng chờ khi có phương tiện hoàn tất sạc, đồng thời phát hiện phương tiện đã sạc đầy nhưng vẫn chiếm dụng cổng sạc để gửi cảnh báo và xử lý Overstay Fee.</w:t>
+            </w:r>
+          </w:p>
+        </w:tc>
+      </w:tr>
+      <w:tr>
+        <w:trPr/>
+        <w:tc>
+          <w:tcPr>
+            <w:tcW w:w="1749" w:type="dxa"/>
+            <w:tcBorders>
+              <w:top w:val="single" w:sz="4" w:space="0" w:color="000000"/>
+              <w:start w:val="single" w:sz="4" w:space="0" w:color="000000"/>
+              <w:bottom w:val="single" w:sz="4" w:space="0" w:color="000000"/>
+              <w:end w:val="single" w:sz="4" w:space="0" w:color="000000"/>
+            </w:tcBorders>
+            <w:vAlign w:val="center"/>
+          </w:tcPr>
+          <w:p>
+            <w:pPr>
+              <w:pStyle w:val="TableContents"/>
+              <w:rPr/>
+            </w:pPr>
+            <w:r>
+              <w:rPr>
+                <w:rStyle w:val="Strong"/>
+              </w:rPr>
+              <w:t>Trigger:</w:t>
+            </w:r>
+          </w:p>
+        </w:tc>
+        <w:tc>
+          <w:tcPr>
+            <w:tcW w:w="7889" w:type="dxa"/>
+            <w:gridSpan w:val="3"/>
+            <w:tcBorders>
+              <w:top w:val="single" w:sz="4" w:space="0" w:color="000000"/>
+              <w:start w:val="single" w:sz="4" w:space="0" w:color="000000"/>
+              <w:bottom w:val="single" w:sz="4" w:space="0" w:color="000000"/>
+              <w:end w:val="single" w:sz="4" w:space="0" w:color="000000"/>
+            </w:tcBorders>
+            <w:vAlign w:val="center"/>
+          </w:tcPr>
+          <w:p>
+            <w:pPr>
+              <w:pStyle w:val="BodyText"/>
+              <w:bidi w:val="0"/>
+              <w:spacing w:before="0" w:after="140"/>
+              <w:rPr/>
+            </w:pPr>
+            <w:r>
+              <w:rPr/>
+              <w:t xml:space="preserve">Chuyên viên sạc mở chức năng </w:t>
+            </w:r>
+            <w:r>
+              <w:rPr>
+                <w:rStyle w:val="Strong"/>
+              </w:rPr>
+              <w:t>Giám sát hàng chờ sạc</w:t>
+            </w:r>
+            <w:r>
+              <w:rPr/>
+              <w:t>. Hoặc hệ thống tự động cập nhật khi trạng thái phương tiện/cổng sạc thay đổi.</w:t>
+            </w:r>
+          </w:p>
+        </w:tc>
+      </w:tr>
+      <w:tr>
+        <w:trPr/>
+        <w:tc>
+          <w:tcPr>
+            <w:tcW w:w="1749" w:type="dxa"/>
+            <w:tcBorders>
+              <w:top w:val="single" w:sz="4" w:space="0" w:color="000000"/>
+              <w:start w:val="single" w:sz="4" w:space="0" w:color="000000"/>
+              <w:bottom w:val="single" w:sz="4" w:space="0" w:color="000000"/>
+              <w:end w:val="single" w:sz="4" w:space="0" w:color="000000"/>
+            </w:tcBorders>
+            <w:vAlign w:val="center"/>
+          </w:tcPr>
+          <w:p>
+            <w:pPr>
+              <w:pStyle w:val="TableContents"/>
+              <w:rPr/>
+            </w:pPr>
+            <w:r>
+              <w:rPr>
+                <w:rStyle w:val="Strong"/>
+              </w:rPr>
+              <w:t>Preconditions:</w:t>
+            </w:r>
+          </w:p>
+        </w:tc>
+        <w:tc>
+          <w:tcPr>
+            <w:tcW w:w="7889" w:type="dxa"/>
+            <w:gridSpan w:val="3"/>
+            <w:tcBorders>
+              <w:top w:val="single" w:sz="4" w:space="0" w:color="000000"/>
+              <w:start w:val="single" w:sz="4" w:space="0" w:color="000000"/>
+              <w:bottom w:val="single" w:sz="4" w:space="0" w:color="000000"/>
+              <w:end w:val="single" w:sz="4" w:space="0" w:color="000000"/>
+            </w:tcBorders>
+            <w:vAlign w:val="center"/>
+          </w:tcPr>
+          <w:p>
+            <w:pPr>
+              <w:pStyle w:val="Normal"/>
+              <w:bidi w:val="0"/>
+              <w:rPr/>
+            </w:pPr>
+            <w:r>
+              <w:rPr/>
+              <w:t>Hệ thống đang hoạt động.</w:t>
+            </w:r>
+          </w:p>
+          <w:p>
+            <w:pPr>
+              <w:pStyle w:val="Normal"/>
+              <w:bidi w:val="0"/>
+              <w:rPr/>
+            </w:pPr>
+            <w:r>
+              <w:rPr/>
+              <w:t>Có dữ liệu về phương tiện và trạng thái các cổng sạc.</w:t>
+            </w:r>
+          </w:p>
+          <w:p>
+            <w:pPr>
+              <w:pStyle w:val="Normal"/>
+              <w:bidi w:val="0"/>
+              <w:rPr/>
+            </w:pPr>
+            <w:r>
+              <w:rPr/>
+              <w:t>Hàng chờ sạc đã được tạo hoặc có phương tiện đang sạc.</w:t>
+            </w:r>
+          </w:p>
+          <w:p>
+            <w:pPr>
+              <w:pStyle w:val="Normal"/>
+              <w:bidi w:val="0"/>
+              <w:rPr/>
+            </w:pPr>
+            <w:r>
+              <w:rPr/>
+              <w:t>Hệ thống có thể nhận dữ liệu trạng thái từ trạm sạc/cảm biến IoT.</w:t>
+            </w:r>
+          </w:p>
+        </w:tc>
+      </w:tr>
+      <w:tr>
+        <w:trPr/>
+        <w:tc>
+          <w:tcPr>
+            <w:tcW w:w="1749" w:type="dxa"/>
+            <w:tcBorders>
+              <w:top w:val="single" w:sz="4" w:space="0" w:color="000000"/>
+              <w:start w:val="single" w:sz="4" w:space="0" w:color="000000"/>
+              <w:bottom w:val="single" w:sz="4" w:space="0" w:color="000000"/>
+              <w:end w:val="single" w:sz="4" w:space="0" w:color="000000"/>
+            </w:tcBorders>
+            <w:vAlign w:val="center"/>
+          </w:tcPr>
+          <w:p>
+            <w:pPr>
+              <w:pStyle w:val="TableContents"/>
+              <w:rPr/>
+            </w:pPr>
+            <w:r>
+              <w:rPr>
+                <w:rStyle w:val="Strong"/>
+              </w:rPr>
+              <w:t>Postconditions:</w:t>
+            </w:r>
+          </w:p>
+        </w:tc>
+        <w:tc>
+          <w:tcPr>
+            <w:tcW w:w="7889" w:type="dxa"/>
+            <w:gridSpan w:val="3"/>
+            <w:tcBorders>
+              <w:top w:val="single" w:sz="4" w:space="0" w:color="000000"/>
+              <w:start w:val="single" w:sz="4" w:space="0" w:color="000000"/>
+              <w:bottom w:val="single" w:sz="4" w:space="0" w:color="000000"/>
+              <w:end w:val="single" w:sz="4" w:space="0" w:color="000000"/>
+            </w:tcBorders>
+            <w:vAlign w:val="center"/>
+          </w:tcPr>
+          <w:p>
+            <w:pPr>
+              <w:pStyle w:val="Normal"/>
+              <w:bidi w:val="0"/>
+              <w:rPr/>
+            </w:pPr>
+            <w:r>
+              <w:rPr/>
+              <w:t>Hàng chờ sạc được cập nhật theo trạng thái mới nhất.</w:t>
+            </w:r>
+          </w:p>
+          <w:p>
+            <w:pPr>
+              <w:pStyle w:val="Normal"/>
+              <w:bidi w:val="0"/>
+              <w:rPr/>
+            </w:pPr>
+            <w:r>
+              <w:rPr/>
+              <w:t>Trạng thái các phương tiện và cổng sạc được cập nhật.</w:t>
+            </w:r>
+          </w:p>
+          <w:p>
+            <w:pPr>
+              <w:pStyle w:val="Normal"/>
+              <w:bidi w:val="0"/>
+              <w:rPr/>
+            </w:pPr>
+            <w:r>
+              <w:rPr/>
+              <w:t>Trạng thái cổng được cập nhật và sẵn sàng để hệ thống phân bổ phương tiện tiếp theo khi có điều kiện phù hợp.</w:t>
+            </w:r>
+          </w:p>
+          <w:p>
+            <w:pPr>
+              <w:pStyle w:val="Normal"/>
+              <w:bidi w:val="0"/>
+              <w:rPr/>
+            </w:pPr>
+            <w:r>
+              <w:rPr/>
+              <w:t>Dashboard hiển thị thông tin hàng chờ và trạng thái cổng sạc.</w:t>
+            </w:r>
+          </w:p>
+          <w:p>
+            <w:pPr>
+              <w:pStyle w:val="Normal"/>
+              <w:bidi w:val="0"/>
+              <w:rPr/>
+            </w:pPr>
+            <w:r>
+              <w:rPr/>
+              <w:t>Nếu xe đã sạc đầy nhưng vẫn chiếm cổng quá thời gian ân hạn, hệ thống ghi nhận Overstay Fee.</w:t>
+            </w:r>
+          </w:p>
+        </w:tc>
+      </w:tr>
+      <w:tr>
+        <w:trPr/>
+        <w:tc>
+          <w:tcPr>
+            <w:tcW w:w="1749" w:type="dxa"/>
+            <w:tcBorders>
+              <w:top w:val="single" w:sz="4" w:space="0" w:color="000000"/>
+              <w:start w:val="single" w:sz="4" w:space="0" w:color="000000"/>
+              <w:bottom w:val="single" w:sz="4" w:space="0" w:color="000000"/>
+              <w:end w:val="single" w:sz="4" w:space="0" w:color="000000"/>
+            </w:tcBorders>
+            <w:vAlign w:val="center"/>
+          </w:tcPr>
+          <w:p>
+            <w:pPr>
+              <w:pStyle w:val="TableContents"/>
+              <w:rPr/>
+            </w:pPr>
+            <w:r>
+              <w:rPr>
+                <w:rStyle w:val="Strong"/>
+              </w:rPr>
+              <w:t>Normal Flow:</w:t>
+            </w:r>
+          </w:p>
+        </w:tc>
+        <w:tc>
+          <w:tcPr>
+            <w:tcW w:w="7889" w:type="dxa"/>
+            <w:gridSpan w:val="3"/>
+            <w:tcBorders>
+              <w:top w:val="single" w:sz="4" w:space="0" w:color="000000"/>
+              <w:start w:val="single" w:sz="4" w:space="0" w:color="000000"/>
+              <w:bottom w:val="single" w:sz="4" w:space="0" w:color="000000"/>
+              <w:end w:val="single" w:sz="4" w:space="0" w:color="000000"/>
+            </w:tcBorders>
+            <w:vAlign w:val="center"/>
+          </w:tcPr>
+          <w:p>
+            <w:pPr>
+              <w:pStyle w:val="Normal"/>
+              <w:bidi w:val="0"/>
+              <w:rPr/>
+            </w:pPr>
+            <w:r>
+              <w:rPr/>
+              <w:t>Chuyên viên sạc mở chức năng Giám sát hàng chờ sạc.</w:t>
+            </w:r>
+          </w:p>
+          <w:p>
+            <w:pPr>
+              <w:pStyle w:val="Normal"/>
+              <w:bidi w:val="0"/>
+              <w:rPr/>
+            </w:pPr>
+            <w:r>
+              <w:rPr/>
+              <w:t>Hệ thống lấy danh sách phương tiện đang WAITING_FOR_CHARGING và CHARGING.</w:t>
+            </w:r>
+          </w:p>
+          <w:p>
+            <w:pPr>
+              <w:pStyle w:val="Normal"/>
+              <w:bidi w:val="0"/>
+              <w:rPr/>
+            </w:pPr>
+            <w:r>
+              <w:rPr/>
+              <w:t>Hệ thống hiển thị thứ tự hàng chờ, mức SoC và thời gian chờ của từng phương tiện.</w:t>
+            </w:r>
+          </w:p>
+          <w:p>
+            <w:pPr>
+              <w:pStyle w:val="Normal"/>
+              <w:bidi w:val="0"/>
+              <w:rPr/>
+            </w:pPr>
+            <w:r>
+              <w:rPr/>
+              <w:t>Hệ thống hiển thị trạng thái các cổng sạc: khả dụng, đang sử dụng hoặc lỗi.</w:t>
+            </w:r>
+          </w:p>
+          <w:p>
+            <w:pPr>
+              <w:pStyle w:val="Normal"/>
+              <w:bidi w:val="0"/>
+              <w:rPr/>
+            </w:pPr>
+            <w:r>
+              <w:rPr/>
+              <w:t>Hệ thống liên tục nhận/cập nhật trạng thái từ trạm sạc hoặc cảm biến IoT.</w:t>
+            </w:r>
+          </w:p>
+          <w:p>
+            <w:pPr>
+              <w:pStyle w:val="Normal"/>
+              <w:bidi w:val="0"/>
+              <w:rPr/>
+            </w:pPr>
+            <w:r>
+              <w:rPr/>
+              <w:t>Khi một phương tiện hoàn tất sạc, hệ thống cập nhật trạng thái thành FULLY_CHARGED.</w:t>
+            </w:r>
+          </w:p>
+          <w:p>
+            <w:pPr>
+              <w:pStyle w:val="Normal"/>
+              <w:bidi w:val="0"/>
+              <w:rPr/>
+            </w:pPr>
+            <w:r>
+              <w:rPr/>
+              <w:t>Hệ thống gửi thông báo cho sinh viên/chủ xe.</w:t>
+            </w:r>
+          </w:p>
+          <w:p>
+            <w:pPr>
+              <w:pStyle w:val="Normal"/>
+              <w:bidi w:val="0"/>
+              <w:rPr/>
+            </w:pPr>
+            <w:r>
+              <w:rPr/>
+              <w:t>Hệ thống kiểm tra thời gian phương tiện tiếp tục chiếm dụng cổng sạc.</w:t>
+            </w:r>
+          </w:p>
+          <w:p>
+            <w:pPr>
+              <w:pStyle w:val="Normal"/>
+              <w:bidi w:val="0"/>
+              <w:rPr/>
+            </w:pPr>
+            <w:r>
+              <w:rPr/>
+              <w:t>Nếu phương tiện được di dời hoặc rút sạc trong thời gian ân hạn, hệ thống giải phóng cổng.</w:t>
+            </w:r>
+          </w:p>
+          <w:p>
+            <w:pPr>
+              <w:pStyle w:val="Normal"/>
+              <w:bidi w:val="0"/>
+              <w:rPr/>
+            </w:pPr>
+            <w:r>
+              <w:rPr/>
+              <w:t>Hệ thống cập nhật trạng thái cổng và thông báo/ghi nhận cổng đã được giải phóng để hệ thống lập lịch sạc xử lý phương tiện tiếp theo trong hàng chờ.</w:t>
+            </w:r>
+          </w:p>
+          <w:p>
+            <w:pPr>
+              <w:pStyle w:val="Normal"/>
+              <w:bidi w:val="0"/>
+              <w:rPr/>
+            </w:pPr>
+            <w:r>
+              <w:rPr/>
+              <w:t>Nếu phương tiện không được di dời sau thời gian ân hạn, hệ thống áp dụng Overstay Fee.</w:t>
+            </w:r>
+          </w:p>
+          <w:p>
+            <w:pPr>
+              <w:pStyle w:val="Normal"/>
+              <w:bidi w:val="0"/>
+              <w:rPr/>
+            </w:pPr>
+            <w:r>
+              <w:rPr/>
+              <w:t>Hệ thống cập nhật hàng chờ và trạng thái cổng trên Dashboard.</w:t>
+            </w:r>
+          </w:p>
+        </w:tc>
+      </w:tr>
+      <w:tr>
+        <w:trPr/>
+        <w:tc>
+          <w:tcPr>
+            <w:tcW w:w="1749" w:type="dxa"/>
+            <w:tcBorders>
+              <w:top w:val="single" w:sz="4" w:space="0" w:color="000000"/>
+              <w:start w:val="single" w:sz="4" w:space="0" w:color="000000"/>
+              <w:bottom w:val="single" w:sz="4" w:space="0" w:color="000000"/>
+              <w:end w:val="single" w:sz="4" w:space="0" w:color="000000"/>
+            </w:tcBorders>
+            <w:vAlign w:val="center"/>
+          </w:tcPr>
+          <w:p>
+            <w:pPr>
+              <w:pStyle w:val="TableContents"/>
+              <w:rPr/>
+            </w:pPr>
+            <w:r>
+              <w:rPr>
+                <w:rStyle w:val="Strong"/>
+              </w:rPr>
+              <w:t>Alternative Flows:</w:t>
+            </w:r>
+          </w:p>
+        </w:tc>
+        <w:tc>
+          <w:tcPr>
+            <w:tcW w:w="7889" w:type="dxa"/>
+            <w:gridSpan w:val="3"/>
+            <w:tcBorders>
+              <w:top w:val="single" w:sz="4" w:space="0" w:color="000000"/>
+              <w:start w:val="single" w:sz="4" w:space="0" w:color="000000"/>
+              <w:bottom w:val="single" w:sz="4" w:space="0" w:color="000000"/>
+              <w:end w:val="single" w:sz="4" w:space="0" w:color="000000"/>
+            </w:tcBorders>
+            <w:vAlign w:val="center"/>
+          </w:tcPr>
+          <w:p>
+            <w:pPr>
+              <w:pStyle w:val="Normal"/>
+              <w:bidi w:val="0"/>
+              <w:rPr/>
+            </w:pPr>
+            <w:r>
+              <w:rPr/>
+              <w:t>A1 – Có phương tiện được ưu tiên</w:t>
+            </w:r>
+          </w:p>
+          <w:p>
+            <w:pPr>
+              <w:pStyle w:val="Normal"/>
+              <w:bidi w:val="0"/>
+              <w:rPr/>
+            </w:pPr>
+            <w:r>
+              <w:rPr/>
+              <w:t>Nếu thứ tự hàng chờ được hệ thống lập lịch cập nhật, hệ thống giám sát phản ánh thứ tự mới và cập nhật thông tin trên Dashboard.</w:t>
+            </w:r>
+          </w:p>
+          <w:p>
+            <w:pPr>
+              <w:pStyle w:val="Normal"/>
+              <w:bidi w:val="0"/>
+              <w:rPr/>
+            </w:pPr>
+            <w:r>
+              <w:rPr/>
+            </w:r>
+          </w:p>
+          <w:p>
+            <w:pPr>
+              <w:pStyle w:val="Normal"/>
+              <w:bidi w:val="0"/>
+              <w:rPr/>
+            </w:pPr>
+            <w:r>
+              <w:rPr/>
+              <w:t>A2 – Phương tiện rút sạc sớm</w:t>
+            </w:r>
+          </w:p>
+          <w:p>
+            <w:pPr>
+              <w:pStyle w:val="Normal"/>
+              <w:bidi w:val="0"/>
+              <w:rPr/>
+            </w:pPr>
+            <w:r>
+              <w:rPr/>
+              <w:t>Nếu phương tiện ngừng sạc trước khi đầy, hệ thống cập nhật trạng thái và giải phóng cổng.</w:t>
+            </w:r>
+          </w:p>
+          <w:p>
+            <w:pPr>
+              <w:pStyle w:val="Normal"/>
+              <w:bidi w:val="0"/>
+              <w:rPr/>
+            </w:pPr>
+            <w:r>
+              <w:rPr/>
+              <w:t>Phương tiện tiếp theo đủ điều kiện được đưa vào sạc.</w:t>
+            </w:r>
+          </w:p>
+          <w:p>
+            <w:pPr>
+              <w:pStyle w:val="Normal"/>
+              <w:bidi w:val="0"/>
+              <w:rPr/>
+            </w:pPr>
+            <w:r>
+              <w:rPr/>
+            </w:r>
+          </w:p>
+          <w:p>
+            <w:pPr>
+              <w:pStyle w:val="Normal"/>
+              <w:bidi w:val="0"/>
+              <w:rPr/>
+            </w:pPr>
+            <w:r>
+              <w:rPr/>
+              <w:t>A3 – Phương tiện đã sạc đầy và di dời đúng hạn</w:t>
+            </w:r>
+          </w:p>
+          <w:p>
+            <w:pPr>
+              <w:pStyle w:val="Normal"/>
+              <w:bidi w:val="0"/>
+              <w:rPr/>
+            </w:pPr>
+            <w:r>
+              <w:rPr/>
+              <w:t>Hệ thống phát hiện phương tiện đã rời cổng hoặc đã rút sạc.</w:t>
+            </w:r>
+          </w:p>
+          <w:p>
+            <w:pPr>
+              <w:pStyle w:val="Normal"/>
+              <w:bidi w:val="0"/>
+              <w:rPr/>
+            </w:pPr>
+            <w:r>
+              <w:rPr/>
+              <w:t>Hệ thống giải phóng cổng.</w:t>
+            </w:r>
+          </w:p>
+          <w:p>
+            <w:pPr>
+              <w:pStyle w:val="Normal"/>
+              <w:bidi w:val="0"/>
+              <w:rPr/>
+            </w:pPr>
+            <w:r>
+              <w:rPr/>
+              <w:t>Phương tiện tiếp theo trong hàng chờ được xử lý.</w:t>
+            </w:r>
+          </w:p>
+        </w:tc>
+      </w:tr>
+      <w:tr>
+        <w:trPr/>
+        <w:tc>
+          <w:tcPr>
+            <w:tcW w:w="1749" w:type="dxa"/>
+            <w:tcBorders>
+              <w:top w:val="single" w:sz="4" w:space="0" w:color="000000"/>
+              <w:start w:val="single" w:sz="4" w:space="0" w:color="000000"/>
+              <w:bottom w:val="single" w:sz="4" w:space="0" w:color="000000"/>
+              <w:end w:val="single" w:sz="4" w:space="0" w:color="000000"/>
+            </w:tcBorders>
+            <w:vAlign w:val="center"/>
+          </w:tcPr>
+          <w:p>
+            <w:pPr>
+              <w:pStyle w:val="TableContents"/>
+              <w:rPr/>
+            </w:pPr>
+            <w:r>
+              <w:rPr>
+                <w:rStyle w:val="Strong"/>
+              </w:rPr>
+              <w:t>Exceptions:</w:t>
+            </w:r>
+          </w:p>
+        </w:tc>
+        <w:tc>
+          <w:tcPr>
+            <w:tcW w:w="7889" w:type="dxa"/>
+            <w:gridSpan w:val="3"/>
+            <w:tcBorders>
+              <w:top w:val="single" w:sz="4" w:space="0" w:color="000000"/>
+              <w:start w:val="single" w:sz="4" w:space="0" w:color="000000"/>
+              <w:bottom w:val="single" w:sz="4" w:space="0" w:color="000000"/>
+              <w:end w:val="single" w:sz="4" w:space="0" w:color="000000"/>
+            </w:tcBorders>
+            <w:vAlign w:val="center"/>
+          </w:tcPr>
+          <w:p>
+            <w:pPr>
+              <w:pStyle w:val="Normal"/>
+              <w:bidi w:val="0"/>
+              <w:rPr/>
+            </w:pPr>
+            <w:r>
+              <w:rPr/>
+              <w:t>E1 – Mất dữ liệu trạng thái</w:t>
+            </w:r>
+          </w:p>
+          <w:p>
+            <w:pPr>
+              <w:pStyle w:val="Normal"/>
+              <w:bidi w:val="0"/>
+              <w:rPr/>
+            </w:pPr>
+            <w:r>
+              <w:rPr/>
+              <w:t>Nếu hệ thống không nhận được dữ liệu từ trạm sạc/IoT, hệ thống đánh dấu trạng thái là UNKNOWN.</w:t>
+            </w:r>
+          </w:p>
+          <w:p>
+            <w:pPr>
+              <w:pStyle w:val="Normal"/>
+              <w:bidi w:val="0"/>
+              <w:rPr/>
+            </w:pPr>
+            <w:r>
+              <w:rPr/>
+              <w:t>Hệ thống thông báo cho chuyên viên vận hành.</w:t>
+            </w:r>
+          </w:p>
+          <w:p>
+            <w:pPr>
+              <w:pStyle w:val="Normal"/>
+              <w:bidi w:val="0"/>
+              <w:rPr/>
+            </w:pPr>
+            <w:r>
+              <w:rPr/>
+              <w:t>Không tự động phân bổ phương tiện vào cổng có trạng thái không xác định.</w:t>
+            </w:r>
+          </w:p>
+          <w:p>
+            <w:pPr>
+              <w:pStyle w:val="Normal"/>
+              <w:bidi w:val="0"/>
+              <w:rPr/>
+            </w:pPr>
+            <w:r>
+              <w:rPr/>
+            </w:r>
+          </w:p>
+          <w:p>
+            <w:pPr>
+              <w:pStyle w:val="Normal"/>
+              <w:bidi w:val="0"/>
+              <w:rPr/>
+            </w:pPr>
+            <w:r>
+              <w:rPr/>
+              <w:t>E2 – Cổng sạc bị lỗi</w:t>
+            </w:r>
+          </w:p>
+          <w:p>
+            <w:pPr>
+              <w:pStyle w:val="Normal"/>
+              <w:bidi w:val="0"/>
+              <w:rPr/>
+            </w:pPr>
+            <w:r>
+              <w:rPr/>
+              <w:t>Hệ thống phát hiện cổng sạc lỗi.</w:t>
+            </w:r>
+          </w:p>
+          <w:p>
+            <w:pPr>
+              <w:pStyle w:val="Normal"/>
+              <w:bidi w:val="0"/>
+              <w:rPr/>
+            </w:pPr>
+            <w:r>
+              <w:rPr/>
+              <w:t>Chuyển trạng thái cổng thành UNAVAILABLE.</w:t>
+            </w:r>
+          </w:p>
+          <w:p>
+            <w:pPr>
+              <w:pStyle w:val="Normal"/>
+              <w:bidi w:val="0"/>
+              <w:rPr/>
+            </w:pPr>
+            <w:r>
+              <w:rPr/>
+              <w:t>Không phân bổ phương tiện mới vào cổng.</w:t>
+            </w:r>
+          </w:p>
+          <w:p>
+            <w:pPr>
+              <w:pStyle w:val="Normal"/>
+              <w:bidi w:val="0"/>
+              <w:rPr/>
+            </w:pPr>
+            <w:r>
+              <w:rPr/>
+              <w:t>Phương tiện đang chờ tiếp tục nằm trong hàng đợi.</w:t>
+            </w:r>
+          </w:p>
+          <w:p>
+            <w:pPr>
+              <w:pStyle w:val="Normal"/>
+              <w:bidi w:val="0"/>
+              <w:rPr/>
+            </w:pPr>
+            <w:r>
+              <w:rPr/>
+            </w:r>
+          </w:p>
+          <w:p>
+            <w:pPr>
+              <w:pStyle w:val="Normal"/>
+              <w:bidi w:val="0"/>
+              <w:rPr/>
+            </w:pPr>
+            <w:r>
+              <w:rPr/>
+              <w:t>E3 – Xe sạc đầy nhưng không di dời</w:t>
+            </w:r>
+          </w:p>
+          <w:p>
+            <w:pPr>
+              <w:pStyle w:val="Normal"/>
+              <w:bidi w:val="0"/>
+              <w:rPr/>
+            </w:pPr>
+            <w:r>
+              <w:rPr/>
+              <w:t>Khi xe đạt 100%, hệ thống gửi cảnh báo cho chủ xe.</w:t>
+            </w:r>
+          </w:p>
+          <w:p>
+            <w:pPr>
+              <w:pStyle w:val="Normal"/>
+              <w:bidi w:val="0"/>
+              <w:rPr/>
+            </w:pPr>
+            <w:r>
+              <w:rPr/>
+              <w:t>Bắt đầu thời gian ân hạn 15 phút.</w:t>
+            </w:r>
+          </w:p>
+          <w:p>
+            <w:pPr>
+              <w:pStyle w:val="Normal"/>
+              <w:bidi w:val="0"/>
+              <w:rPr/>
+            </w:pPr>
+            <w:r>
+              <w:rPr/>
+              <w:t>Nếu hết 15 phút mà xe vẫn chiếm dụng cổng, hệ thống áp dụng Overstay Fee và cập nhật chi phí.</w:t>
+            </w:r>
+          </w:p>
+        </w:tc>
+      </w:tr>
+      <w:tr>
+        <w:trPr>
+          <w:trHeight w:val="489" w:hRule="atLeast"/>
+        </w:trPr>
+        <w:tc>
+          <w:tcPr>
+            <w:tcW w:w="1749" w:type="dxa"/>
+            <w:tcBorders>
+              <w:top w:val="single" w:sz="4" w:space="0" w:color="000000"/>
+              <w:start w:val="single" w:sz="4" w:space="0" w:color="000000"/>
+              <w:bottom w:val="single" w:sz="4" w:space="0" w:color="000000"/>
+              <w:end w:val="single" w:sz="4" w:space="0" w:color="000000"/>
+            </w:tcBorders>
+            <w:vAlign w:val="center"/>
+          </w:tcPr>
+          <w:p>
+            <w:pPr>
+              <w:pStyle w:val="TableContents"/>
+              <w:rPr/>
+            </w:pPr>
+            <w:r>
+              <w:rPr>
+                <w:rStyle w:val="Strong"/>
+              </w:rPr>
+              <w:t>Notes and Issues:</w:t>
+            </w:r>
+          </w:p>
+        </w:tc>
+        <w:tc>
+          <w:tcPr>
+            <w:tcW w:w="7889" w:type="dxa"/>
+            <w:gridSpan w:val="3"/>
+            <w:tcBorders>
+              <w:top w:val="single" w:sz="4" w:space="0" w:color="000000"/>
+              <w:start w:val="single" w:sz="4" w:space="0" w:color="000000"/>
+              <w:bottom w:val="single" w:sz="4" w:space="0" w:color="000000"/>
+              <w:end w:val="single" w:sz="4" w:space="0" w:color="000000"/>
+            </w:tcBorders>
+            <w:vAlign w:val="center"/>
+          </w:tcPr>
+          <w:p>
+            <w:pPr>
+              <w:pStyle w:val="Normal"/>
+              <w:bidi w:val="0"/>
+              <w:rPr/>
+            </w:pPr>
+            <w:r>
+              <w:rPr/>
+              <w:t>UC2 tập trung vào việc giám sát hàng chờ, trạng thái cổng sạc, trạng thái phương tiện và xử lý phương tiện đã sạc đầy nhưng chưa rời cổng. Thuật toán xác định mức độ ưu tiên và lập lịch sạc thuộc UC1 – Lập lịch ưu tiên sạc tự động.</w:t>
             </w:r>
           </w:p>
         </w:tc>
@@ -1477,7 +2721,6 @@
     <w:lvl w:ilvl="2">
       <w:start w:val="1"/>
       <w:numFmt w:val="none"/>
-      <w:pStyle w:val="Heading3"/>
       <w:suff w:val="nothing"/>
       <w:lvlText w:val=""/>
       <w:lvlJc w:val="start"/>
@@ -2070,6 +3313,12 @@
       <w:rFonts w:ascii="Liberation Mono" w:hAnsi="Liberation Mono" w:eastAsia="Liberation Mono" w:cs="Liberation Mono"/>
     </w:rPr>
   </w:style>
+  <w:style w:type="character" w:styleId="Bullets">
+    <w:name w:val="Bullets"/>
+    <w:rPr>
+      <w:rFonts w:ascii="OpenSymbol" w:hAnsi="OpenSymbol" w:eastAsia="OpenSymbol" w:cs="OpenSymbol"/>
+    </w:rPr>
+  </w:style>
   <w:style w:type="paragraph" w:styleId="Heading" w:customStyle="1">
     <w:name w:val="Heading"/>
     <w:basedOn w:val="Normal"/>
@@ -2121,8 +3370,8 @@
     </w:pPr>
     <w:rPr/>
   </w:style>
-  <w:style w:type="paragraph" w:styleId="BlockQuotationuser" w:customStyle="1">
-    <w:name w:val="Block Quotation (user)"/>
+  <w:style w:type="paragraph" w:styleId="BlockQuotation" w:customStyle="1">
+    <w:name w:val="Block Quotation"/>
     <w:basedOn w:val="Normal"/>
     <w:qFormat/>
     <w:pPr>

</xml_diff>